<commit_message>
Remove Bonafide Certificate and Candidate Declaration pages from report
</commit_message>
<xml_diff>
--- a/docs/IFRDSS_Formal_Project_Report.docx
+++ b/docs/IFRDSS_Formal_Project_Report.docx
@@ -275,239 +275,6 @@
     <w:p>
       <w:r>
         <w:br w:type="page"/>
-      </w:r>
-    </w:p>
-    <w:p>
-      <w:pPr>
-        <w:spacing w:before="400" w:after="400"/>
-        <w:jc w:val="center"/>
-      </w:pPr>
-      <w:r>
-        <w:rPr>
-          <w:rFonts w:ascii="Arial" w:hAnsi="Arial"/>
-          <w:b/>
-          <w:color w:val="0F172A"/>
-          <w:sz w:val="32"/>
-        </w:rPr>
-        <w:t>BONAFIDE CERTIFICATE</w:t>
-      </w:r>
-    </w:p>
-    <w:p>
-      <w:pPr>
-        <w:spacing w:after="120" w:line="276" w:lineRule="auto"/>
-      </w:pPr>
-      <w:r>
-        <w:rPr>
-          <w:rFonts w:ascii="Calibri" w:hAnsi="Calibri"/>
-          <w:i w:val="0"/>
-          <w:color w:val="1E293B"/>
-          <w:sz w:val="22"/>
-        </w:rPr>
-        <w:t>This is to certify that the project report entitled 'INTELLIGENT FLOOD RESCUE DECISION SUPPORT SYSTEM (IFRDSS)' is the bonafide work carried out by Asritha Reddy Pappireddy in partial fulfillment of the requirements for the award of the degree of Bachelor of Technology in Computer Science and Engineering during the academic year 2025 - 2026.</w:t>
-      </w:r>
-    </w:p>
-    <w:p>
-      <w:pPr>
-        <w:spacing w:after="120" w:line="276" w:lineRule="auto"/>
-      </w:pPr>
-      <w:r>
-        <w:rPr>
-          <w:rFonts w:ascii="Calibri" w:hAnsi="Calibri"/>
-          <w:i w:val="0"/>
-          <w:color w:val="1E293B"/>
-          <w:sz w:val="22"/>
-        </w:rPr>
-        <w:t>The project work presented in this report comprises the design, implementation, and automated testing of a computer vision and decision support web system for flood rescue triage, including automated testing with pytest and performance load testing with Apache JMeter under my supervision.</w:t>
-      </w:r>
-    </w:p>
-    <w:p>
-      <w:pPr>
-        <w:spacing w:after="900"/>
-      </w:pPr>
-    </w:p>
-    <w:tbl>
-      <w:tblPr>
-        <w:tblW w:type="auto" w:w="0"/>
-        <w:jc w:val="center"/>
-        <w:tblLook w:firstColumn="1" w:firstRow="1" w:lastColumn="0" w:lastRow="0" w:noHBand="0" w:noVBand="1" w:val="04A0"/>
-      </w:tblPr>
-      <w:tblGrid>
-        <w:gridCol w:w="4680"/>
-        <w:gridCol w:w="4680"/>
-      </w:tblGrid>
-      <w:tr>
-        <w:tc>
-          <w:tcPr>
-            <w:tcW w:type="dxa" w:w="4608"/>
-            <w:tcMar>
-              <w:top w:w="80" w:type="dxa"/>
-              <w:bottom w:w="80" w:type="dxa"/>
-              <w:left w:w="50" w:type="dxa"/>
-              <w:right w:w="50" w:type="dxa"/>
-            </w:tcMar>
-          </w:tcPr>
-          <w:p>
-            <w:r>
-              <w:rPr>
-                <w:b/>
-                <w:color w:val="0F172A"/>
-                <w:sz w:val="19"/>
-              </w:rPr>
-              <w:t>____________________________________</w:t>
-              <w:br/>
-              <w:t>PROJECT GUIDE / SUPERVISOR</w:t>
-              <w:br/>
-              <w:t>Department of Computer Science &amp; Engineering</w:t>
-            </w:r>
-          </w:p>
-        </w:tc>
-        <w:tc>
-          <w:tcPr>
-            <w:tcW w:type="dxa" w:w="4608"/>
-            <w:tcMar>
-              <w:top w:w="80" w:type="dxa"/>
-              <w:bottom w:w="80" w:type="dxa"/>
-              <w:left w:w="50" w:type="dxa"/>
-              <w:right w:w="50" w:type="dxa"/>
-            </w:tcMar>
-          </w:tcPr>
-          <w:p>
-            <w:r>
-              <w:rPr>
-                <w:b/>
-                <w:color w:val="0F172A"/>
-                <w:sz w:val="19"/>
-              </w:rPr>
-              <w:t>____________________________________</w:t>
-              <w:br/>
-              <w:t>HEAD OF THE DEPARTMENT</w:t>
-              <w:br/>
-              <w:t>Department of Computer Science &amp; Engineering</w:t>
-            </w:r>
-          </w:p>
-        </w:tc>
-      </w:tr>
-      <w:tr>
-        <w:tc>
-          <w:tcPr>
-            <w:tcW w:type="dxa" w:w="4608"/>
-            <w:tcMar>
-              <w:top w:w="80" w:type="dxa"/>
-              <w:bottom w:w="80" w:type="dxa"/>
-              <w:left w:w="50" w:type="dxa"/>
-              <w:right w:w="50" w:type="dxa"/>
-            </w:tcMar>
-          </w:tcPr>
-          <w:p>
-            <w:r>
-              <w:rPr>
-                <w:b/>
-                <w:color w:val="0F172A"/>
-                <w:sz w:val="19"/>
-              </w:rPr>
-              <w:t>____________________________________</w:t>
-              <w:br/>
-              <w:t>INTERNAL EXAMINER</w:t>
-              <w:br/>
-              <w:t>Date: ____ / ____ / 2026</w:t>
-            </w:r>
-          </w:p>
-        </w:tc>
-        <w:tc>
-          <w:tcPr>
-            <w:tcW w:type="dxa" w:w="4608"/>
-            <w:tcMar>
-              <w:top w:w="80" w:type="dxa"/>
-              <w:bottom w:w="80" w:type="dxa"/>
-              <w:left w:w="50" w:type="dxa"/>
-              <w:right w:w="50" w:type="dxa"/>
-            </w:tcMar>
-          </w:tcPr>
-          <w:p>
-            <w:r>
-              <w:rPr>
-                <w:b/>
-                <w:color w:val="0F172A"/>
-                <w:sz w:val="19"/>
-              </w:rPr>
-              <w:t>____________________________________</w:t>
-              <w:br/>
-              <w:t>EXTERNAL EXAMINER</w:t>
-              <w:br/>
-              <w:t>Date: ____ / ____ / 2026</w:t>
-            </w:r>
-          </w:p>
-        </w:tc>
-      </w:tr>
-    </w:tbl>
-    <w:p>
-      <w:r>
-        <w:br w:type="page"/>
-      </w:r>
-    </w:p>
-    <w:p>
-      <w:pPr>
-        <w:spacing w:before="400" w:after="160"/>
-      </w:pPr>
-      <w:r>
-        <w:rPr>
-          <w:rFonts w:ascii="Arial" w:hAnsi="Arial"/>
-          <w:b/>
-          <w:color w:val="0F172A"/>
-          <w:sz w:val="32"/>
-        </w:rPr>
-        <w:t>CANDIDATE DECLARATION</w:t>
-      </w:r>
-    </w:p>
-    <w:p>
-      <w:pPr>
-        <w:spacing w:after="120" w:line="276" w:lineRule="auto"/>
-      </w:pPr>
-      <w:r>
-        <w:rPr>
-          <w:rFonts w:ascii="Calibri" w:hAnsi="Calibri"/>
-          <w:i w:val="0"/>
-          <w:color w:val="1E293B"/>
-          <w:sz w:val="22"/>
-        </w:rPr>
-        <w:t>I hereby declare that this capstone project report titled 'INTELLIGENT FLOOD RESCUE DECISION SUPPORT SYSTEM (IFRDSS)' has been written and prepared by me, Asritha Reddy Pappireddy, in partial fulfillment of the requirements for the award of Bachelor of Technology in Computer Science and Engineering.</w:t>
-      </w:r>
-    </w:p>
-    <w:p>
-      <w:pPr>
-        <w:spacing w:after="120" w:line="276" w:lineRule="auto"/>
-      </w:pPr>
-      <w:r>
-        <w:rPr>
-          <w:rFonts w:ascii="Calibri" w:hAnsi="Calibri"/>
-          <w:i w:val="0"/>
-          <w:color w:val="1E293B"/>
-          <w:sz w:val="22"/>
-        </w:rPr>
-        <w:t>I confirm that this project represents my own practical work, code implementation, and testing. All code files, algorithms, and test plans documented here have been implemented, tested, and validated on our local development system. All literature, reference papers, and external software libraries (FastAPI, OpenCV, scikit-learn, Apache JMeter, Selenium, pytest) used in this work have been properly cited and acknowledged.</w:t>
-      </w:r>
-    </w:p>
-    <w:p>
-      <w:pPr>
-        <w:spacing w:before="320" w:after="400"/>
-      </w:pPr>
-      <w:r>
-        <w:rPr>
-          <w:rFonts w:ascii="Calibri" w:hAnsi="Calibri"/>
-          <w:b/>
-          <w:color w:val="0F172A"/>
-          <w:sz w:val="20"/>
-        </w:rPr>
-        <w:t>Date: 24th October 2026</w:t>
-        <w:br/>
-        <w:t>Place: Campus</w:t>
-        <w:br/>
-        <w:br/>
-        <w:t>___________________________________</w:t>
-        <w:br/>
-        <w:t>Asritha Reddy Pappireddy</w:t>
-        <w:br/>
-        <w:t>Student, Dept. of Computer Science &amp; Engineering</w:t>
       </w:r>
     </w:p>
     <w:p>
@@ -698,7 +465,7 @@
                 <w:color w:val="0F172A"/>
                 <w:sz w:val="19"/>
               </w:rPr>
-              <w:t>Bonafide Certificate</w:t>
+              <w:t>Acknowledgement</w:t>
             </w:r>
           </w:p>
         </w:tc>
@@ -723,7 +490,7 @@
                 <w:color w:val="0F172A"/>
                 <w:sz w:val="19"/>
               </w:rPr>
-              <w:t>ii</w:t>
+              <w:t>i</w:t>
             </w:r>
           </w:p>
         </w:tc>
@@ -747,7 +514,7 @@
                 <w:color w:val="0F172A"/>
                 <w:sz w:val="19"/>
               </w:rPr>
-              <w:t>Candidate Declaration</w:t>
+              <w:t>Abstract</w:t>
             </w:r>
           </w:p>
         </w:tc>
@@ -772,7 +539,7 @@
                 <w:color w:val="0F172A"/>
                 <w:sz w:val="19"/>
               </w:rPr>
-              <w:t>iii</w:t>
+              <w:t>ii</w:t>
             </w:r>
           </w:p>
         </w:tc>
@@ -792,11 +559,10 @@
             <w:r>
               <w:rPr>
                 <w:rFonts w:ascii="Calibri" w:hAnsi="Calibri"/>
-                <w:b/>
-                <w:color w:val="0F172A"/>
+                <w:color w:val="1E293B"/>
                 <w:sz w:val="19"/>
               </w:rPr>
-              <w:t>Acknowledgement</w:t>
+              <w:t>List of Figures</w:t>
             </w:r>
           </w:p>
         </w:tc>
@@ -817,8 +583,7 @@
             <w:r>
               <w:rPr>
                 <w:rFonts w:ascii="Calibri" w:hAnsi="Calibri"/>
-                <w:b/>
-                <w:color w:val="0F172A"/>
+                <w:color w:val="64748B"/>
                 <w:sz w:val="19"/>
               </w:rPr>
               <w:t>iv</w:t>
@@ -841,11 +606,10 @@
             <w:r>
               <w:rPr>
                 <w:rFonts w:ascii="Calibri" w:hAnsi="Calibri"/>
-                <w:b/>
-                <w:color w:val="0F172A"/>
+                <w:color w:val="1E293B"/>
                 <w:sz w:val="19"/>
               </w:rPr>
-              <w:t>Abstract</w:t>
+              <w:t>List of Tables</w:t>
             </w:r>
           </w:p>
         </w:tc>
@@ -866,105 +630,10 @@
             <w:r>
               <w:rPr>
                 <w:rFonts w:ascii="Calibri" w:hAnsi="Calibri"/>
-                <w:b/>
-                <w:color w:val="0F172A"/>
-                <w:sz w:val="19"/>
-              </w:rPr>
-              <w:t>v</w:t>
-            </w:r>
-          </w:p>
-        </w:tc>
-      </w:tr>
-      <w:tr>
-        <w:tc>
-          <w:tcPr>
-            <w:tcW w:type="dxa" w:w="7920"/>
-            <w:tcMar>
-              <w:top w:w="25" w:type="dxa"/>
-              <w:bottom w:w="25" w:type="dxa"/>
-              <w:left w:w="35" w:type="dxa"/>
-              <w:right w:w="35" w:type="dxa"/>
-            </w:tcMar>
-          </w:tcPr>
-          <w:p>
-            <w:r>
-              <w:rPr>
-                <w:rFonts w:ascii="Calibri" w:hAnsi="Calibri"/>
-                <w:color w:val="1E293B"/>
-                <w:sz w:val="19"/>
-              </w:rPr>
-              <w:t>List of Figures</w:t>
-            </w:r>
-          </w:p>
-        </w:tc>
-        <w:tc>
-          <w:tcPr>
-            <w:tcW w:type="dxa" w:w="1440"/>
-            <w:tcMar>
-              <w:top w:w="25" w:type="dxa"/>
-              <w:bottom w:w="25" w:type="dxa"/>
-              <w:left w:w="35" w:type="dxa"/>
-              <w:right w:w="35" w:type="dxa"/>
-            </w:tcMar>
-          </w:tcPr>
-          <w:p>
-            <w:pPr>
-              <w:jc w:val="right"/>
-            </w:pPr>
-            <w:r>
-              <w:rPr>
-                <w:rFonts w:ascii="Calibri" w:hAnsi="Calibri"/>
                 <w:color w:val="64748B"/>
                 <w:sz w:val="19"/>
               </w:rPr>
-              <w:t>vii</w:t>
-            </w:r>
-          </w:p>
-        </w:tc>
-      </w:tr>
-      <w:tr>
-        <w:tc>
-          <w:tcPr>
-            <w:tcW w:type="dxa" w:w="7920"/>
-            <w:tcMar>
-              <w:top w:w="25" w:type="dxa"/>
-              <w:bottom w:w="25" w:type="dxa"/>
-              <w:left w:w="35" w:type="dxa"/>
-              <w:right w:w="35" w:type="dxa"/>
-            </w:tcMar>
-          </w:tcPr>
-          <w:p>
-            <w:r>
-              <w:rPr>
-                <w:rFonts w:ascii="Calibri" w:hAnsi="Calibri"/>
-                <w:color w:val="1E293B"/>
-                <w:sz w:val="19"/>
-              </w:rPr>
-              <w:t>List of Tables</w:t>
-            </w:r>
-          </w:p>
-        </w:tc>
-        <w:tc>
-          <w:tcPr>
-            <w:tcW w:type="dxa" w:w="1440"/>
-            <w:tcMar>
-              <w:top w:w="25" w:type="dxa"/>
-              <w:bottom w:w="25" w:type="dxa"/>
-              <w:left w:w="35" w:type="dxa"/>
-              <w:right w:w="35" w:type="dxa"/>
-            </w:tcMar>
-          </w:tcPr>
-          <w:p>
-            <w:pPr>
-              <w:jc w:val="right"/>
-            </w:pPr>
-            <w:r>
-              <w:rPr>
-                <w:rFonts w:ascii="Calibri" w:hAnsi="Calibri"/>
-                <w:color w:val="64748B"/>
-                <w:sz w:val="19"/>
-              </w:rPr>
-              <w:t>viii</w:t>
+              <w:t>v</w:t>
             </w:r>
           </w:p>
         </w:tc>

</xml_diff>

<commit_message>
Remove Acknowledgement page and update TOC
</commit_message>
<xml_diff>
--- a/docs/IFRDSS_Formal_Project_Report.docx
+++ b/docs/IFRDSS_Formal_Project_Report.docx
@@ -272,67 +272,6 @@
         </w:tc>
       </w:tr>
     </w:tbl>
-    <w:p>
-      <w:r>
-        <w:br w:type="page"/>
-      </w:r>
-    </w:p>
-    <w:p>
-      <w:pPr>
-        <w:spacing w:before="400" w:after="160"/>
-      </w:pPr>
-      <w:r>
-        <w:rPr>
-          <w:rFonts w:ascii="Arial" w:hAnsi="Arial"/>
-          <w:b/>
-          <w:color w:val="0F172A"/>
-          <w:sz w:val="32"/>
-        </w:rPr>
-        <w:t>ACKNOWLEDGEMENT</w:t>
-      </w:r>
-    </w:p>
-    <w:p>
-      <w:pPr>
-        <w:spacing w:after="120" w:line="276" w:lineRule="auto"/>
-      </w:pPr>
-      <w:r>
-        <w:rPr>
-          <w:rFonts w:ascii="Calibri" w:hAnsi="Calibri"/>
-          <w:i w:val="0"/>
-          <w:color w:val="1E293B"/>
-          <w:sz w:val="22"/>
-        </w:rPr>
-        <w:t>I express my sincere and deep gratitude to my respected Project Guide ('mam') for her continuous guidance, constructive feedback, and encouragement throughout this project. Her advice to study software testing tools--specifically comparing Apache JMeter, Micro Focus LoadRunner, and Selenium, and executing an empirical performance load test using Apache JMeter--greatly improved the engineering depth of this project.</w:t>
-      </w:r>
-    </w:p>
-    <w:p>
-      <w:pPr>
-        <w:spacing w:after="120" w:line="276" w:lineRule="auto"/>
-      </w:pPr>
-      <w:r>
-        <w:rPr>
-          <w:rFonts w:ascii="Calibri" w:hAnsi="Calibri"/>
-          <w:i w:val="0"/>
-          <w:color w:val="1E293B"/>
-          <w:sz w:val="22"/>
-        </w:rPr>
-        <w:t>I also thank our Head of the Department and all the faculty members of the Computer Science and Engineering Department for providing the laboratory facilities and academic environment that enabled me to develop and test this software application.</w:t>
-      </w:r>
-    </w:p>
-    <w:p>
-      <w:pPr>
-        <w:spacing w:after="120" w:line="276" w:lineRule="auto"/>
-      </w:pPr>
-      <w:r>
-        <w:rPr>
-          <w:rFonts w:ascii="Calibri" w:hAnsi="Calibri"/>
-          <w:i w:val="0"/>
-          <w:color w:val="1E293B"/>
-          <w:sz w:val="22"/>
-        </w:rPr>
-        <w:t>Finally, I am grateful to my family and friends for their constant encouragement and support throughout my engineering studies.</w:t>
-      </w:r>
-    </w:p>
     <w:p>
       <w:r>
         <w:br w:type="page"/>
@@ -465,7 +404,7 @@
                 <w:color w:val="0F172A"/>
                 <w:sz w:val="19"/>
               </w:rPr>
-              <w:t>Acknowledgement</w:t>
+              <w:t>Abstract</w:t>
             </w:r>
           </w:p>
         </w:tc>
@@ -510,11 +449,10 @@
             <w:r>
               <w:rPr>
                 <w:rFonts w:ascii="Calibri" w:hAnsi="Calibri"/>
-                <w:b/>
-                <w:color w:val="0F172A"/>
+                <w:color w:val="1E293B"/>
                 <w:sz w:val="19"/>
               </w:rPr>
-              <w:t>Abstract</w:t>
+              <w:t>List of Figures</w:t>
             </w:r>
           </w:p>
         </w:tc>
@@ -535,11 +473,10 @@
             <w:r>
               <w:rPr>
                 <w:rFonts w:ascii="Calibri" w:hAnsi="Calibri"/>
-                <w:b/>
-                <w:color w:val="0F172A"/>
+                <w:color w:val="64748B"/>
                 <w:sz w:val="19"/>
               </w:rPr>
-              <w:t>ii</w:t>
+              <w:t>iii</w:t>
             </w:r>
           </w:p>
         </w:tc>
@@ -562,7 +499,7 @@
                 <w:color w:val="1E293B"/>
                 <w:sz w:val="19"/>
               </w:rPr>
-              <w:t>List of Figures</w:t>
+              <w:t>List of Tables</w:t>
             </w:r>
           </w:p>
         </w:tc>
@@ -587,53 +524,6 @@
                 <w:sz w:val="19"/>
               </w:rPr>
               <w:t>iv</w:t>
-            </w:r>
-          </w:p>
-        </w:tc>
-      </w:tr>
-      <w:tr>
-        <w:tc>
-          <w:tcPr>
-            <w:tcW w:type="dxa" w:w="7920"/>
-            <w:tcMar>
-              <w:top w:w="25" w:type="dxa"/>
-              <w:bottom w:w="25" w:type="dxa"/>
-              <w:left w:w="35" w:type="dxa"/>
-              <w:right w:w="35" w:type="dxa"/>
-            </w:tcMar>
-          </w:tcPr>
-          <w:p>
-            <w:r>
-              <w:rPr>
-                <w:rFonts w:ascii="Calibri" w:hAnsi="Calibri"/>
-                <w:color w:val="1E293B"/>
-                <w:sz w:val="19"/>
-              </w:rPr>
-              <w:t>List of Tables</w:t>
-            </w:r>
-          </w:p>
-        </w:tc>
-        <w:tc>
-          <w:tcPr>
-            <w:tcW w:type="dxa" w:w="1440"/>
-            <w:tcMar>
-              <w:top w:w="25" w:type="dxa"/>
-              <w:bottom w:w="25" w:type="dxa"/>
-              <w:left w:w="35" w:type="dxa"/>
-              <w:right w:w="35" w:type="dxa"/>
-            </w:tcMar>
-          </w:tcPr>
-          <w:p>
-            <w:pPr>
-              <w:jc w:val="right"/>
-            </w:pPr>
-            <w:r>
-              <w:rPr>
-                <w:rFonts w:ascii="Calibri" w:hAnsi="Calibri"/>
-                <w:color w:val="64748B"/>
-                <w:sz w:val="19"/>
-              </w:rPr>
-              <w:t>v</w:t>
             </w:r>
           </w:p>
         </w:tc>

</xml_diff>